<commit_message>
Add Sectors API client + normalization layer for companies, reports, prices, financials, news
Typed wrappers over E-01 (companies screener), E-02 (company report),
E-03 (daily transaction), E-05 (quarterly financials), E-06/E-07 (helper
lists), and E-04 (news), each normalizing raw API responses into domain
types and stamping fetchedAt per ADD-SH2026-003 section 4. Verified
against live API; credit usage logged in the data dictionary.

Co-Authored-By: Claude Sonnet 5 <noreply@anthropic.com>
</commit_message>
<xml_diff>
--- a/docs/API Data Dictionary Sectors Hackathon.docx
+++ b/docs/API Data Dictionary Sectors Hackathon.docx
@@ -4804,7 +4804,7 @@
                 <w:sz w:val="24"/>
                 <w:szCs w:val="24"/>
               </w:rPr>
-              <w:t xml:space="preserve">[Isi]</w:t>
+              <w:t>4 September 2026</w:t>
             </w:r>
           </w:p>
         </w:tc>
@@ -4832,7 +4832,7 @@
                 <w:sz w:val="24"/>
                 <w:szCs w:val="24"/>
               </w:rPr>
-              <w:t xml:space="preserve">Kuota awal</w:t>
+              <w:t>Kuota awal</w:t>
             </w:r>
           </w:p>
         </w:tc>
@@ -4860,7 +4860,7 @@
                 <w:sz w:val="24"/>
                 <w:szCs w:val="24"/>
               </w:rPr>
-              <w:t xml:space="preserve">0</w:t>
+              <w:t>0</w:t>
             </w:r>
           </w:p>
         </w:tc>
@@ -4888,7 +4888,7 @@
                 <w:sz w:val="24"/>
                 <w:szCs w:val="24"/>
               </w:rPr>
-              <w:t xml:space="preserve">1000</w:t>
+              <w:t>1000</w:t>
             </w:r>
           </w:p>
         </w:tc>
@@ -4918,7 +4918,7 @@
                 <w:sz w:val="24"/>
                 <w:szCs w:val="24"/>
               </w:rPr>
-              <w:t xml:space="preserve">[Isi]</w:t>
+              <w:t>4 September 2026</w:t>
             </w:r>
           </w:p>
         </w:tc>
@@ -4946,7 +4946,7 @@
                 <w:sz w:val="24"/>
                 <w:szCs w:val="24"/>
               </w:rPr>
-              <w:t xml:space="preserve">[Isi]</w:t>
+              <w:t>Verifikasi awal koneksi API (uji endpoint subsectors)</w:t>
             </w:r>
           </w:p>
         </w:tc>
@@ -4974,7 +4974,7 @@
                 <w:sz w:val="24"/>
                 <w:szCs w:val="24"/>
               </w:rPr>
-              <w:t xml:space="preserve">[Isi]</w:t>
+              <w:t>1</w:t>
             </w:r>
           </w:p>
         </w:tc>
@@ -5002,7 +5002,7 @@
                 <w:sz w:val="24"/>
                 <w:szCs w:val="24"/>
               </w:rPr>
-              <w:t xml:space="preserve">[Isi]</w:t>
+              <w:t>999</w:t>
             </w:r>
           </w:p>
         </w:tc>
@@ -5032,7 +5032,7 @@
                 <w:sz w:val="24"/>
                 <w:szCs w:val="24"/>
               </w:rPr>
-              <w:t xml:space="preserve">[Isi]</w:t>
+              <w:t>4 September 2026</w:t>
             </w:r>
           </w:p>
         </w:tc>
@@ -5060,7 +5060,7 @@
                 <w:sz w:val="24"/>
                 <w:szCs w:val="24"/>
               </w:rPr>
-              <w:t xml:space="preserve">[Isi]</w:t>
+              <w:t>Uji lapisan data: companies screener, company report, daily transaction, quarterly financials, news</w:t>
             </w:r>
           </w:p>
         </w:tc>
@@ -5088,7 +5088,7 @@
                 <w:sz w:val="24"/>
                 <w:szCs w:val="24"/>
               </w:rPr>
-              <w:t xml:space="preserve">[Isi]</w:t>
+              <w:t>5</w:t>
             </w:r>
           </w:p>
         </w:tc>
@@ -5116,7 +5116,7 @@
                 <w:sz w:val="24"/>
                 <w:szCs w:val="24"/>
               </w:rPr>
-              <w:t xml:space="preserve">[Isi]</w:t>
+              <w:t>994</w:t>
             </w:r>
           </w:p>
         </w:tc>

</xml_diff>

<commit_message>
Define composite score formula and weights, log technical decisions
Skor Komposit Fundamental (F-01): ROE 25%, margin laba bersih 20%,
DER 20% (dibalik), margin arus kas operasional 20%, ROA 15%, dihitung
sebagai percentile rank per sub-sektor. Didokumentasikan di ADD D-01/D-02
dan dicatat sebagai keputusan teknis beserta alasannya di TSD bagian 11,
termasuk keputusan sebelumnya (React, Node.js backend, Gemini) yang
belum tercatat.

Co-Authored-By: Claude Sonnet 5 <noreply@anthropic.com>
</commit_message>
<xml_diff>
--- a/docs/API Data Dictionary Sectors Hackathon.docx
+++ b/docs/API Data Dictionary Sectors Hackathon.docx
@@ -2210,7 +2210,7 @@
                 <w:sz w:val="24"/>
                 <w:szCs w:val="24"/>
               </w:rPr>
-              <w:t xml:space="preserve">Gabungan beberapa komponen rasio fundamental yang telah dinormalisasi dan diberi bobot, dinyatakan pada skala nol sampai seratus.</w:t>
+              <w:t>Rata-rata tertimbang dari persentil 5 komponen (dalam sub-sektor yang sama): ROE 25%, Margin Laba Bersih 20%, DER 20% (arah dibalik, rendah=baik), Margin Arus Kas Operasional 20%, ROA 15%. Skala 0-100. Emiten kehilangan &gt;1 komponen tidak diberi skor (data tidak memadai); kehilangan 1 komponen, bobot 4 komponen sisanya dinormalisasi ulang secara proporsional.</w:t>
             </w:r>
           </w:p>
         </w:tc>
@@ -2324,7 +2324,7 @@
                 <w:sz w:val="24"/>
                 <w:szCs w:val="24"/>
               </w:rPr>
-              <w:t xml:space="preserve">Nilai setiap rasio penyusun skor setelah normalisasi, disimpan terpisah agar asal-usul skor dapat ditelusuri.</w:t>
+              <w:t>Nilai persentil per komponen (ROE, ROA, Margin Laba Bersih, DER, Margin Arus Kas Operasional) dari section financials.historical_financial_ratio tahun fiskal terbaru, disimpan terpisah agar asal-usul Skor Komposit dapat ditelusuri per komponen.</w:t>
             </w:r>
           </w:p>
         </w:tc>

</xml_diff>

<commit_message>
Implement F-01: composite fundamental score engine + /api/emiten/:symbol/skor
- percentile.ts: shared percentile-rank helper (average-rank ties),
  reused later by F-03 peer comparison.
- score.ts: pure computeCompositeScore() applying the locked formula
  (ROE 25% / margin laba 20% / DER 20% inverted / margin arus kas 20% /
  ROA 15%), with >1 missing component -> inadequate, 1 missing ->
  proportional weight renormalization.
- scoreService.ts: orchestrates data-layer calls (target report, peer
  screener by sub-sector, peer financials with bounded concurrency) and
  feeds them to the pure scorer.
- routes/emiten.ts: GET /api/emiten/:symbol/skor?peerLimit=N

Verified against live data (BBCA vs 7 peer banks, score 69.38) and unit
cases (best/worst-in-group, 1 missing component, 2 missing -> no score).
10 credits logged in the data dictionary.

Co-Authored-By: Claude Sonnet 5 <noreply@anthropic.com>
</commit_message>
<xml_diff>
--- a/docs/API Data Dictionary Sectors Hackathon.docx
+++ b/docs/API Data Dictionary Sectors Hackathon.docx
@@ -5231,6 +5231,48 @@
                 <w:szCs w:val="24"/>
               </w:rPr>
               <w:t xml:space="preserve">[Isi]</w:t>
+            </w:r>
+          </w:p>
+        </w:tc>
+      </w:tr>
+      <w:tr>
+        <w:tc>
+          <w:tcPr>
+            <w:tcW w:type="dxa" w:w="1600"/>
+          </w:tcPr>
+          <w:p>
+            <w:r>
+              <w:t>4 September 2026</w:t>
+            </w:r>
+          </w:p>
+        </w:tc>
+        <w:tc>
+          <w:tcPr>
+            <w:tcW w:type="dxa" w:w="4200"/>
+          </w:tcPr>
+          <w:p>
+            <w:r>
+              <w:t>Uji F-01 Skor Komposit (BBCA + 7 peer bank: overview+financials target, screener, financials tiap peer)</w:t>
+            </w:r>
+          </w:p>
+        </w:tc>
+        <w:tc>
+          <w:tcPr>
+            <w:tcW w:type="dxa" w:w="1600"/>
+          </w:tcPr>
+          <w:p>
+            <w:r>
+              <w:t>10</w:t>
+            </w:r>
+          </w:p>
+        </w:tc>
+        <w:tc>
+          <w:tcPr>
+            <w:tcW w:type="dxa" w:w="1626"/>
+          </w:tcPr>
+          <w:p>
+            <w:r>
+              <w:t>984</w:t>
             </w:r>
           </w:p>
         </w:tc>

</xml_diff>

<commit_message>
Implement F-02: custom screener/ranking logic + GET /api/screener
- screener.ts: getScoredCompaniesInSubSector() scores every company in a
  sub-sector against one shared peer group (one screener call + one
  financials fetch per company, not per target), then screenCompanies()
  applies our own filter/sort logic (score range, per-component raw-value
  ranges, sort by score or any component) — never delegates to Sectors'
  where/order_by for computed fields, since composite score doesn't exist
  in their API.
- scoreService.ts refactored to delegate to getScoredCompaniesInSubSector
  instead of its own peer-fetch, so a company's score on its detail page
  (F-01) is always identical to its score in screener results (F-02) —
  verified live (BBCA: 69.5 via both paths).
- routes/screener.ts: GET /api/screener?subSector=&sortBy=&minRoe=&maxDer=...

Co-Authored-By: Claude Sonnet 5 <noreply@anthropic.com>
</commit_message>
<xml_diff>
--- a/docs/API Data Dictionary Sectors Hackathon.docx
+++ b/docs/API Data Dictionary Sectors Hackathon.docx
@@ -5273,6 +5273,48 @@
           <w:p>
             <w:r>
               <w:t>984</w:t>
+            </w:r>
+          </w:p>
+        </w:tc>
+      </w:tr>
+      <w:tr>
+        <w:tc>
+          <w:tcPr>
+            <w:tcW w:type="dxa" w:w="1600"/>
+          </w:tcPr>
+          <w:p>
+            <w:r>
+              <w:t>4 September 2026</w:t>
+            </w:r>
+          </w:p>
+        </w:tc>
+        <w:tc>
+          <w:tcPr>
+            <w:tcW w:type="dxa" w:w="4200"/>
+          </w:tcPr>
+          <w:p>
+            <w:r>
+              <w:t>Uji F-02 Screener (10 bank, verifikasi konsistensi skor dengan F-01 + filter komponen)</w:t>
+            </w:r>
+          </w:p>
+        </w:tc>
+        <w:tc>
+          <w:tcPr>
+            <w:tcW w:type="dxa" w:w="1600"/>
+          </w:tcPr>
+          <w:p>
+            <w:r>
+              <w:t>3</w:t>
+            </w:r>
+          </w:p>
+        </w:tc>
+        <w:tc>
+          <w:tcPr>
+            <w:tcW w:type="dxa" w:w="1626"/>
+          </w:tcPr>
+          <w:p>
+            <w:r>
+              <w:t>981</w:t>
             </w:r>
           </w:p>
         </w:tc>

</xml_diff>

<commit_message>
Update roadmap status for F-02, fix duplicate credit log entry
Co-Authored-By: Claude Sonnet 5 <noreply@anthropic.com>
</commit_message>
<xml_diff>
--- a/docs/API Data Dictionary Sectors Hackathon.docx
+++ b/docs/API Data Dictionary Sectors Hackathon.docx
@@ -5117,120 +5117,6 @@
                 <w:szCs w:val="24"/>
               </w:rPr>
               <w:t>994</w:t>
-            </w:r>
-          </w:p>
-        </w:tc>
-      </w:tr>
-      <w:tr>
-        <w:tc>
-          <w:tcPr>
-            <w:tcW w:type="dxa" w:w="1600"/>
-            <w:tcMar>
-              <w:top w:type="dxa" w:w="60"/>
-              <w:left w:type="dxa" w:w="100"/>
-              <w:bottom w:type="dxa" w:w="60"/>
-              <w:right w:type="dxa" w:w="100"/>
-            </w:tcMar>
-          </w:tcPr>
-          <w:p>
-            <w:pPr>
-              <w:spacing w:after="0" w:line="240"/>
-              <w:jc w:val="left"/>
-            </w:pPr>
-            <w:r>
-              <w:rPr>
-                <w:rFonts w:ascii="Times New Roman" w:cs="Times New Roman" w:eastAsia="Times New Roman" w:hAnsi="Times New Roman"/>
-                <w:b w:val="false"/>
-                <w:bCs w:val="false"/>
-                <w:color w:val="000000"/>
-                <w:sz w:val="24"/>
-                <w:szCs w:val="24"/>
-              </w:rPr>
-              <w:t xml:space="preserve">[Isi]</w:t>
-            </w:r>
-          </w:p>
-        </w:tc>
-        <w:tc>
-          <w:tcPr>
-            <w:tcW w:type="dxa" w:w="4200"/>
-            <w:tcMar>
-              <w:top w:type="dxa" w:w="60"/>
-              <w:left w:type="dxa" w:w="100"/>
-              <w:bottom w:type="dxa" w:w="60"/>
-              <w:right w:type="dxa" w:w="100"/>
-            </w:tcMar>
-          </w:tcPr>
-          <w:p>
-            <w:pPr>
-              <w:spacing w:after="0" w:line="240"/>
-              <w:jc w:val="left"/>
-            </w:pPr>
-            <w:r>
-              <w:rPr>
-                <w:rFonts w:ascii="Times New Roman" w:cs="Times New Roman" w:eastAsia="Times New Roman" w:hAnsi="Times New Roman"/>
-                <w:b w:val="false"/>
-                <w:bCs w:val="false"/>
-                <w:color w:val="000000"/>
-                <w:sz w:val="24"/>
-                <w:szCs w:val="24"/>
-              </w:rPr>
-              <w:t xml:space="preserve">[Isi]</w:t>
-            </w:r>
-          </w:p>
-        </w:tc>
-        <w:tc>
-          <w:tcPr>
-            <w:tcW w:type="dxa" w:w="1600"/>
-            <w:tcMar>
-              <w:top w:type="dxa" w:w="60"/>
-              <w:left w:type="dxa" w:w="100"/>
-              <w:bottom w:type="dxa" w:w="60"/>
-              <w:right w:type="dxa" w:w="100"/>
-            </w:tcMar>
-          </w:tcPr>
-          <w:p>
-            <w:pPr>
-              <w:spacing w:after="0" w:line="240"/>
-              <w:jc w:val="left"/>
-            </w:pPr>
-            <w:r>
-              <w:rPr>
-                <w:rFonts w:ascii="Times New Roman" w:cs="Times New Roman" w:eastAsia="Times New Roman" w:hAnsi="Times New Roman"/>
-                <w:b w:val="false"/>
-                <w:bCs w:val="false"/>
-                <w:color w:val="000000"/>
-                <w:sz w:val="24"/>
-                <w:szCs w:val="24"/>
-              </w:rPr>
-              <w:t xml:space="preserve">[Isi]</w:t>
-            </w:r>
-          </w:p>
-        </w:tc>
-        <w:tc>
-          <w:tcPr>
-            <w:tcW w:type="dxa" w:w="1626"/>
-            <w:tcMar>
-              <w:top w:type="dxa" w:w="60"/>
-              <w:left w:type="dxa" w:w="100"/>
-              <w:bottom w:type="dxa" w:w="60"/>
-              <w:right w:type="dxa" w:w="100"/>
-            </w:tcMar>
-          </w:tcPr>
-          <w:p>
-            <w:pPr>
-              <w:spacing w:after="0" w:line="240"/>
-              <w:jc w:val="left"/>
-            </w:pPr>
-            <w:r>
-              <w:rPr>
-                <w:rFonts w:ascii="Times New Roman" w:cs="Times New Roman" w:eastAsia="Times New Roman" w:hAnsi="Times New Roman"/>
-                <w:b w:val="false"/>
-                <w:bCs w:val="false"/>
-                <w:color w:val="000000"/>
-                <w:sz w:val="24"/>
-                <w:szCs w:val="24"/>
-              </w:rPr>
-              <w:t xml:space="preserve">[Isi]</w:t>
             </w:r>
           </w:p>
         </w:tc>

</xml_diff>

<commit_message>
Implement F-03: peer/sector comparison via GET /api/emiten/:symbol/peer
peerComparison.ts reuses getScoredCompaniesInSubSector (F-01/F-02's
engine) instead of recomputing anything: same sub-sector peer group,
same percentile math. Response surfaces the 5 composite-score components
as percentile positions (kriteria selesai: minimal 3 metrik) plus the
full peer list and its size, so the comparison group and its size are
always shown alongside the percentile.

Verified live against BBCA/banks — fully served from cache built during
F-01/F-02 testing (0 additional credits), which also confirms the cache
layer is working as intended.

Co-Authored-By: Claude Sonnet 5 <noreply@anthropic.com>
</commit_message>
<xml_diff>
--- a/docs/API Data Dictionary Sectors Hackathon.docx
+++ b/docs/API Data Dictionary Sectors Hackathon.docx
@@ -5191,6 +5191,48 @@
           <w:p>
             <w:r>
               <w:t>3</w:t>
+            </w:r>
+          </w:p>
+        </w:tc>
+        <w:tc>
+          <w:tcPr>
+            <w:tcW w:type="dxa" w:w="1626"/>
+          </w:tcPr>
+          <w:p>
+            <w:r>
+              <w:t>981</w:t>
+            </w:r>
+          </w:p>
+        </w:tc>
+      </w:tr>
+      <w:tr>
+        <w:tc>
+          <w:tcPr>
+            <w:tcW w:type="dxa" w:w="1600"/>
+          </w:tcPr>
+          <w:p>
+            <w:r>
+              <w:t>4 September 2026</w:t>
+            </w:r>
+          </w:p>
+        </w:tc>
+        <w:tc>
+          <w:tcPr>
+            <w:tcW w:type="dxa" w:w="4200"/>
+          </w:tcPr>
+          <w:p>
+            <w:r>
+              <w:t>Uji F-03 Perbandingan Peer (BBCA, 10 bank) -- seluruhnya dari cache F-01/F-02</w:t>
+            </w:r>
+          </w:p>
+        </w:tc>
+        <w:tc>
+          <w:tcPr>
+            <w:tcW w:type="dxa" w:w="1600"/>
+          </w:tcPr>
+          <w:p>
+            <w:r>
+              <w:t>0</w:t>
             </w:r>
           </w:p>
         </w:tc>

</xml_diff>

<commit_message>
Reconcile credit log with real usage-log CSV from Sectors dashboard
Logged the 24-call Food & Beverage / bank-daily activity the user
generated exploring the running app manually, and flagged prior ~-marked
entries as manual estimates pending reconciliation against the dashboard's
actual remaining balance.

Co-Authored-By: Claude Sonnet 5 <noreply@anthropic.com>
</commit_message>
<xml_diff>
--- a/docs/API Data Dictionary Sectors Hackathon.docx
+++ b/docs/API Data Dictionary Sectors Hackathon.docx
@@ -4678,6 +4678,11 @@
       </w:r>
     </w:p>
     <w:p>
+      <w:r>
+        <w:t>Catatan: angka pada kolom Kredit Terpakai untuk entri sebelum baris eksplorasi Food &amp; Beverage bertanda ~ adalah estimasi manual berdasarkan jumlah panggilan API yang dilakukan, bukan hasil pembacaan langsung dari dashboard Sectors. Entri berikutnya diverifikasi terhadap usage-log CSV resmi dari dashboard.</w:t>
+      </w:r>
+    </w:p>
+    <w:p>
       <w:pPr>
         <w:spacing w:after="120"/>
       </w:pPr>
@@ -5537,6 +5542,48 @@
           <w:p>
             <w:r>
               <w:t>~946</w:t>
+            </w:r>
+          </w:p>
+        </w:tc>
+      </w:tr>
+      <w:tr>
+        <w:tc>
+          <w:tcPr>
+            <w:tcW w:type="dxa" w:w="1600"/>
+          </w:tcPr>
+          <w:p>
+            <w:r>
+              <w:t>4 September 2026</w:t>
+            </w:r>
+          </w:p>
+        </w:tc>
+        <w:tc>
+          <w:tcPr>
+            <w:tcW w:type="dxa" w:w="4200"/>
+          </w:tcPr>
+          <w:p>
+            <w:r>
+              <w:t>Eksplorasi manual oleh pengerja (screener sub-sektor Food &amp; Beverage ~19 emiten + beberapa daily bank) -- terverifikasi via usage-log CSV resmi dari dashboard Sectors, bukan estimasi.</w:t>
+            </w:r>
+          </w:p>
+        </w:tc>
+        <w:tc>
+          <w:tcPr>
+            <w:tcW w:type="dxa" w:w="1600"/>
+          </w:tcPr>
+          <w:p>
+            <w:r>
+              <w:t>24 (dari 24 baris log CSV yang diberikan; log CSV hanya memuat aktivitas terbaru, bukan riwayat penuh)</w:t>
+            </w:r>
+          </w:p>
+        </w:tc>
+        <w:tc>
+          <w:tcPr>
+            <w:tcW w:type="dxa" w:w="1626"/>
+          </w:tcPr>
+          <w:p>
+            <w:r>
+              <w:t>Lihat catatan</w:t>
             </w:r>
           </w:p>
         </w:tc>

</xml_diff>

<commit_message>
Log actual dev velocity vs roadmap estimates, reconcile credits with dashboard
Roadmap: added a velocity-notes section derived from git commit
timestamps -- 4h41m real time covered ~227 of 336 estimated roadmap
hours (68%), a ~48x compression attributable to AI-assisted development,
not a flaw in the original estimates (which remain realistic for
unassisted solo manual coding).

API Data Dictionary: final credit reconciliation against the real
Sectors dashboard (Plans & Usage) -- 195 requests used, 805 remaining,
expires Sep 30 2026. Flagged that prior manual log entries undercounted
significantly (~58 tracked vs 195 actual) and should not be trusted over
the dashboard figure.

Co-Authored-By: Claude Sonnet 5 <noreply@anthropic.com>
</commit_message>
<xml_diff>
--- a/docs/API Data Dictionary Sectors Hackathon.docx
+++ b/docs/API Data Dictionary Sectors Hackathon.docx
@@ -5782,6 +5782,48 @@
           <w:p>
             <w:r>
               <w:t>~942</w:t>
+            </w:r>
+          </w:p>
+        </w:tc>
+      </w:tr>
+      <w:tr>
+        <w:tc>
+          <w:tcPr>
+            <w:tcW w:type="dxa" w:w="1600"/>
+          </w:tcPr>
+          <w:p>
+            <w:r>
+              <w:t>4 September 2026</w:t>
+            </w:r>
+          </w:p>
+        </w:tc>
+        <w:tc>
+          <w:tcPr>
+            <w:tcW w:type="dxa" w:w="4200"/>
+          </w:tcPr>
+          <w:p>
+            <w:r>
+              <w:t>REKONSILIASI FINAL dari dashboard Sectors (Plans &amp; Usage): 195 request periode ini, 100% success. Seluruh estimasi manual di atas baris ini TIDAK AKURAT (total tercatat manual ~58, realita 195) -- gunakan angka dashboard sebagai kebenaran, bukan log manual di atas.</w:t>
+            </w:r>
+          </w:p>
+        </w:tc>
+        <w:tc>
+          <w:tcPr>
+            <w:tcW w:type="dxa" w:w="1600"/>
+          </w:tcPr>
+          <w:p>
+            <w:r>
+              <w:t>195 (aktual, dari dashboard)</w:t>
+            </w:r>
+          </w:p>
+        </w:tc>
+        <w:tc>
+          <w:tcPr>
+            <w:tcW w:type="dxa" w:w="1626"/>
+          </w:tcPr>
+          <w:p>
+            <w:r>
+              <w:t>805 (aktual, dari dashboard, expires 30 Sep 2026)</w:t>
             </w:r>
           </w:p>
         </w:tc>

</xml_diff>